<commit_message>
add mosfet driver, footprint & mosfet symbol
</commit_message>
<xml_diff>
--- a/Documentation.docx
+++ b/Documentation.docx
@@ -58,34 +58,7 @@
           <w:bCs/>
           <w:lang w:val="en-GB"/>
         </w:rPr>
-        <w:t>INA180A1IDBVR</w:t>
-      </w:r>
-      <w:r>
-        <w:rPr>
-          <w:rFonts w:ascii="Times New Roman" w:hAnsi="Times New Roman" w:cs="Times New Roman"/>
-          <w:b/>
-          <w:bCs/>
-          <w:lang w:val="en-GB"/>
-        </w:rPr>
-        <w:t xml:space="preserve"> </w:t>
-      </w:r>
-      <w:r>
-        <w:rPr>
-          <w:rFonts w:ascii="Times New Roman" w:hAnsi="Times New Roman" w:cs="Times New Roman"/>
-          <w:b/>
-          <w:bCs/>
-          <w:lang w:val="en-GB"/>
-        </w:rPr>
-        <w:t>TEXAS INSTRUMENTS</w:t>
-      </w:r>
-      <w:r>
-        <w:rPr>
-          <w:rFonts w:ascii="Times New Roman" w:hAnsi="Times New Roman" w:cs="Times New Roman"/>
-          <w:b/>
-          <w:bCs/>
-          <w:lang w:val="en-GB"/>
-        </w:rPr>
-        <w:t xml:space="preserve"> – Measure </w:t>
+        <w:t xml:space="preserve">INA180A1IDBVR TEXAS INSTRUMENTS – Measure </w:t>
       </w:r>
       <w:proofErr w:type="spellStart"/>
       <w:r>
@@ -144,30 +117,14 @@
           <w:bCs/>
           <w:lang w:val="en-GB"/>
         </w:rPr>
-        <w:t>WSL25121L000FEA</w:t>
-      </w:r>
-      <w:r>
-        <w:rPr>
-          <w:rFonts w:ascii="Times New Roman" w:hAnsi="Times New Roman" w:cs="Times New Roman"/>
-          <w:b/>
-          <w:bCs/>
+        <w:t xml:space="preserve">WSL25121L000FEA – Shunt resistor </w:t>
+      </w:r>
+      <w:r>
+        <w:rPr>
+          <w:rFonts w:ascii="Times New Roman" w:hAnsi="Times New Roman" w:cs="Times New Roman"/>
           <w:lang w:val="en-GB"/>
         </w:rPr>
-        <w:t xml:space="preserve"> – Shunt resistor </w:t>
-      </w:r>
-      <w:r>
-        <w:rPr>
-          <w:rFonts w:ascii="Times New Roman" w:hAnsi="Times New Roman" w:cs="Times New Roman"/>
-          <w:lang w:val="en-GB"/>
-        </w:rPr>
-        <w:t xml:space="preserve">- </w:t>
-      </w:r>
-      <w:r>
-        <w:rPr>
-          <w:rFonts w:ascii="Times New Roman" w:hAnsi="Times New Roman" w:cs="Times New Roman"/>
-          <w:lang w:val="en-GB"/>
-        </w:rPr>
-        <w:t>https://www.tme.eu/pl/details/wsl25121l000fea/rezystory-smd/vishay/</w:t>
+        <w:t>- https://www.tme.eu/pl/details/wsl25121l000fea/rezystory-smd/vishay/</w:t>
       </w:r>
     </w:p>
     <w:p>
@@ -203,6 +160,9 @@
     </w:p>
     <w:p>
       <w:r>
+        <w:rPr>
+          <w:noProof/>
+        </w:rPr>
         <w:drawing>
           <wp:inline distT="0" distB="0" distL="0" distR="0" wp14:anchorId="04C68720" wp14:editId="4F3A77D1">
             <wp:extent cx="4182059" cy="2867425"/>
@@ -244,17 +204,29 @@
       <w:pPr>
         <w:rPr>
           <w:rFonts w:ascii="Times New Roman" w:hAnsi="Times New Roman" w:cs="Times New Roman"/>
-        </w:rPr>
-      </w:pPr>
-      <w:r>
-        <w:rPr>
-          <w:rFonts w:ascii="Times New Roman" w:hAnsi="Times New Roman" w:cs="Times New Roman"/>
-        </w:rPr>
-        <w:t>Cbypass – 0.1uF</w:t>
-      </w:r>
-      <w:r>
-        <w:rPr>
-          <w:rFonts w:ascii="Times New Roman" w:hAnsi="Times New Roman" w:cs="Times New Roman"/>
+          <w:lang w:val="en-GB"/>
+        </w:rPr>
+      </w:pPr>
+      <w:proofErr w:type="spellStart"/>
+      <w:r>
+        <w:rPr>
+          <w:rFonts w:ascii="Times New Roman" w:hAnsi="Times New Roman" w:cs="Times New Roman"/>
+          <w:lang w:val="en-GB"/>
+        </w:rPr>
+        <w:t>Cbypass</w:t>
+      </w:r>
+      <w:proofErr w:type="spellEnd"/>
+      <w:r>
+        <w:rPr>
+          <w:rFonts w:ascii="Times New Roman" w:hAnsi="Times New Roman" w:cs="Times New Roman"/>
+          <w:lang w:val="en-GB"/>
+        </w:rPr>
+        <w:t xml:space="preserve"> – 0.1uF</w:t>
+      </w:r>
+      <w:r>
+        <w:rPr>
+          <w:rFonts w:ascii="Times New Roman" w:hAnsi="Times New Roman" w:cs="Times New Roman"/>
+          <w:lang w:val="en-GB"/>
         </w:rPr>
         <w:t xml:space="preserve"> 0805</w:t>
       </w:r>
@@ -292,6 +264,9 @@
     </w:p>
     <w:p>
       <w:r>
+        <w:rPr>
+          <w:noProof/>
+        </w:rPr>
         <w:lastRenderedPageBreak/>
         <w:drawing>
           <wp:inline distT="0" distB="0" distL="0" distR="0" wp14:anchorId="56AB1A2E" wp14:editId="7D182EF9">
@@ -331,6 +306,17 @@
       </w:r>
     </w:p>
     <w:p/>
+    <w:p/>
+    <w:p/>
+    <w:p/>
+    <w:p/>
+    <w:p/>
+    <w:p/>
+    <w:p/>
+    <w:p/>
+    <w:p/>
+    <w:p/>
+    <w:p/>
     <w:p>
       <w:pPr>
         <w:pStyle w:val="ListParagraph"/>
@@ -350,16 +336,360 @@
           <w:sz w:val="40"/>
           <w:szCs w:val="40"/>
         </w:rPr>
+        <w:lastRenderedPageBreak/>
         <w:t>Voltage sense</w:t>
       </w:r>
     </w:p>
     <w:p>
       <w:pPr>
+        <w:pStyle w:val="ListParagraph"/>
+        <w:rPr>
+          <w:rFonts w:ascii="Times New Roman" w:hAnsi="Times New Roman" w:cs="Times New Roman"/>
+        </w:rPr>
+      </w:pPr>
+      <w:r>
+        <w:rPr>
+          <w:rFonts w:ascii="Times New Roman" w:hAnsi="Times New Roman" w:cs="Times New Roman"/>
+        </w:rPr>
+        <w:t>Components used:</w:t>
+      </w:r>
+    </w:p>
+    <w:p>
+      <w:pPr>
+        <w:pStyle w:val="ListParagraph"/>
+        <w:numPr>
+          <w:ilvl w:val="0"/>
+          <w:numId w:val="3"/>
+        </w:numPr>
+        <w:rPr>
+          <w:rFonts w:ascii="Times New Roman" w:hAnsi="Times New Roman" w:cs="Times New Roman"/>
+          <w:lang w:val="en-GB"/>
+        </w:rPr>
+      </w:pPr>
+      <w:r>
+        <w:rPr>
+          <w:rFonts w:ascii="Times New Roman" w:hAnsi="Times New Roman" w:cs="Times New Roman"/>
+          <w:lang w:val="en-GB"/>
+        </w:rPr>
+        <w:t>0603 if no space 0402 would b</w:t>
+      </w:r>
+      <w:r>
+        <w:rPr>
+          <w:rFonts w:ascii="Times New Roman" w:hAnsi="Times New Roman" w:cs="Times New Roman"/>
+          <w:lang w:val="en-GB"/>
+        </w:rPr>
+        <w:t>e enough</w:t>
+      </w:r>
+    </w:p>
+    <w:p>
+      <w:pPr>
         <w:ind w:left="360"/>
-        <w:rPr>
-          <w:rFonts w:ascii="Times New Roman" w:hAnsi="Times New Roman" w:cs="Times New Roman"/>
-        </w:rPr>
-      </w:pPr>
+        <w:jc w:val="center"/>
+        <w:rPr>
+          <w:rFonts w:ascii="Times New Roman" w:hAnsi="Times New Roman" w:cs="Times New Roman"/>
+          <w:lang w:val="en-GB"/>
+        </w:rPr>
+      </w:pPr>
+      <w:r>
+        <w:rPr>
+          <w:rFonts w:ascii="Times New Roman" w:hAnsi="Times New Roman" w:cs="Times New Roman"/>
+          <w:lang w:val="en-GB"/>
+        </w:rPr>
+        <w:drawing>
+          <wp:inline distT="0" distB="0" distL="0" distR="0" wp14:anchorId="5BE90FA4" wp14:editId="56E218EC">
+            <wp:extent cx="2038350" cy="3958783"/>
+            <wp:effectExtent l="0" t="0" r="0" b="3810"/>
+            <wp:docPr id="298486909" name="Picture 1"/>
+            <wp:cNvGraphicFramePr>
+              <a:graphicFrameLocks xmlns:a="http://schemas.openxmlformats.org/drawingml/2006/main" noChangeAspect="1"/>
+            </wp:cNvGraphicFramePr>
+            <a:graphic xmlns:a="http://schemas.openxmlformats.org/drawingml/2006/main">
+              <a:graphicData uri="http://schemas.openxmlformats.org/drawingml/2006/picture">
+                <pic:pic xmlns:pic="http://schemas.openxmlformats.org/drawingml/2006/picture">
+                  <pic:nvPicPr>
+                    <pic:cNvPr id="298486909" name=""/>
+                    <pic:cNvPicPr/>
+                  </pic:nvPicPr>
+                  <pic:blipFill>
+                    <a:blip r:embed="rId8"/>
+                    <a:stretch>
+                      <a:fillRect/>
+                    </a:stretch>
+                  </pic:blipFill>
+                  <pic:spPr>
+                    <a:xfrm>
+                      <a:off x="0" y="0"/>
+                      <a:ext cx="2041188" cy="3964294"/>
+                    </a:xfrm>
+                    <a:prstGeom prst="rect">
+                      <a:avLst/>
+                    </a:prstGeom>
+                  </pic:spPr>
+                </pic:pic>
+              </a:graphicData>
+            </a:graphic>
+          </wp:inline>
+        </w:drawing>
+      </w:r>
+    </w:p>
+    <w:p>
+      <w:pPr>
+        <w:pStyle w:val="ListParagraph"/>
+        <w:numPr>
+          <w:ilvl w:val="0"/>
+          <w:numId w:val="1"/>
+        </w:numPr>
+        <w:rPr>
+          <w:rFonts w:ascii="Times New Roman" w:hAnsi="Times New Roman" w:cs="Times New Roman"/>
+          <w:sz w:val="40"/>
+          <w:szCs w:val="40"/>
+        </w:rPr>
+      </w:pPr>
+      <w:r>
+        <w:rPr>
+          <w:rFonts w:ascii="Times New Roman" w:hAnsi="Times New Roman" w:cs="Times New Roman"/>
+          <w:sz w:val="40"/>
+          <w:szCs w:val="40"/>
+        </w:rPr>
+        <w:t>Input fuse</w:t>
+      </w:r>
+    </w:p>
+    <w:p>
+      <w:pPr>
+        <w:pStyle w:val="ListParagraph"/>
+        <w:rPr>
+          <w:rFonts w:ascii="Times New Roman" w:hAnsi="Times New Roman" w:cs="Times New Roman"/>
+        </w:rPr>
+      </w:pPr>
+      <w:r>
+        <w:rPr>
+          <w:rFonts w:ascii="Times New Roman" w:hAnsi="Times New Roman" w:cs="Times New Roman"/>
+        </w:rPr>
+        <w:t>Components used:</w:t>
+      </w:r>
+    </w:p>
+    <w:p>
+      <w:pPr>
+        <w:pStyle w:val="ListParagraph"/>
+        <w:numPr>
+          <w:ilvl w:val="0"/>
+          <w:numId w:val="5"/>
+        </w:numPr>
+        <w:rPr>
+          <w:rFonts w:ascii="Times New Roman" w:hAnsi="Times New Roman" w:cs="Times New Roman"/>
+        </w:rPr>
+      </w:pPr>
+      <w:r>
+        <w:rPr>
+          <w:rFonts w:ascii="Times New Roman" w:hAnsi="Times New Roman" w:cs="Times New Roman"/>
+        </w:rPr>
+        <w:t>824520241</w:t>
+      </w:r>
+      <w:r>
+        <w:rPr>
+          <w:rFonts w:ascii="Times New Roman" w:hAnsi="Times New Roman" w:cs="Times New Roman"/>
+        </w:rPr>
+        <w:t xml:space="preserve"> </w:t>
+      </w:r>
+      <w:hyperlink r:id="rId9" w:history="1">
+        <w:r>
+          <w:rPr>
+            <w:rStyle w:val="Hyperlink"/>
+            <w:rFonts w:ascii="Times New Roman" w:hAnsi="Times New Roman" w:cs="Times New Roman"/>
+          </w:rPr>
+          <w:t>https://www.mouser.pl/ProductDetail/Wurth-Elektronik/824520241?qs=16w8nSHsg3uKVUUFBUEZqQ%3D%3D&amp;srsltid=AfmBOop1oNRK73h6PYblkd6TIQEBREtDRCMnubtJOaHP4bXpcaUnDrmp</w:t>
+        </w:r>
+      </w:hyperlink>
+    </w:p>
+    <w:p>
+      <w:pPr>
+        <w:pStyle w:val="ListParagraph"/>
+        <w:ind w:left="1800"/>
+        <w:rPr>
+          <w:rFonts w:ascii="Times New Roman" w:hAnsi="Times New Roman" w:cs="Times New Roman"/>
+        </w:rPr>
+      </w:pPr>
+    </w:p>
+    <w:p>
+      <w:pPr>
+        <w:jc w:val="center"/>
+        <w:rPr>
+          <w:rFonts w:ascii="Times New Roman" w:hAnsi="Times New Roman" w:cs="Times New Roman"/>
+        </w:rPr>
+      </w:pPr>
+      <w:r>
+        <w:rPr>
+          <w:rFonts w:ascii="Times New Roman" w:hAnsi="Times New Roman" w:cs="Times New Roman"/>
+        </w:rPr>
+        <w:drawing>
+          <wp:inline distT="0" distB="0" distL="0" distR="0" wp14:anchorId="0140A4C9" wp14:editId="3CCDF26B">
+            <wp:extent cx="1574800" cy="2182955"/>
+            <wp:effectExtent l="0" t="0" r="6350" b="8255"/>
+            <wp:docPr id="1523666689" name="Picture 1"/>
+            <wp:cNvGraphicFramePr>
+              <a:graphicFrameLocks xmlns:a="http://schemas.openxmlformats.org/drawingml/2006/main" noChangeAspect="1"/>
+            </wp:cNvGraphicFramePr>
+            <a:graphic xmlns:a="http://schemas.openxmlformats.org/drawingml/2006/main">
+              <a:graphicData uri="http://schemas.openxmlformats.org/drawingml/2006/picture">
+                <pic:pic xmlns:pic="http://schemas.openxmlformats.org/drawingml/2006/picture">
+                  <pic:nvPicPr>
+                    <pic:cNvPr id="1523666689" name=""/>
+                    <pic:cNvPicPr/>
+                  </pic:nvPicPr>
+                  <pic:blipFill>
+                    <a:blip r:embed="rId10"/>
+                    <a:stretch>
+                      <a:fillRect/>
+                    </a:stretch>
+                  </pic:blipFill>
+                  <pic:spPr>
+                    <a:xfrm>
+                      <a:off x="0" y="0"/>
+                      <a:ext cx="1579333" cy="2189238"/>
+                    </a:xfrm>
+                    <a:prstGeom prst="rect">
+                      <a:avLst/>
+                    </a:prstGeom>
+                  </pic:spPr>
+                </pic:pic>
+              </a:graphicData>
+            </a:graphic>
+          </wp:inline>
+        </w:drawing>
+      </w:r>
+    </w:p>
+    <w:p>
+      <w:pPr>
+        <w:pStyle w:val="ListParagraph"/>
+        <w:numPr>
+          <w:ilvl w:val="0"/>
+          <w:numId w:val="1"/>
+        </w:numPr>
+        <w:rPr>
+          <w:rFonts w:ascii="Times New Roman" w:hAnsi="Times New Roman" w:cs="Times New Roman"/>
+          <w:sz w:val="40"/>
+          <w:szCs w:val="40"/>
+        </w:rPr>
+      </w:pPr>
+      <w:r>
+        <w:rPr>
+          <w:rFonts w:ascii="Times New Roman" w:hAnsi="Times New Roman" w:cs="Times New Roman"/>
+          <w:sz w:val="40"/>
+          <w:szCs w:val="40"/>
+        </w:rPr>
+        <w:lastRenderedPageBreak/>
+        <w:t>MOSFET Driver</w:t>
+      </w:r>
+    </w:p>
+    <w:p>
+      <w:pPr>
+        <w:pStyle w:val="ListParagraph"/>
+        <w:numPr>
+          <w:ilvl w:val="0"/>
+          <w:numId w:val="1"/>
+        </w:numPr>
+        <w:rPr>
+          <w:rFonts w:ascii="Times New Roman" w:hAnsi="Times New Roman" w:cs="Times New Roman"/>
+          <w:sz w:val="40"/>
+          <w:szCs w:val="40"/>
+        </w:rPr>
+      </w:pPr>
+      <w:r>
+        <w:rPr>
+          <w:rFonts w:ascii="Times New Roman" w:hAnsi="Times New Roman" w:cs="Times New Roman"/>
+          <w:sz w:val="40"/>
+          <w:szCs w:val="40"/>
+        </w:rPr>
+        <w:t>MCU</w:t>
+      </w:r>
+    </w:p>
+    <w:p>
+      <w:pPr>
+        <w:pStyle w:val="ListParagraph"/>
+        <w:numPr>
+          <w:ilvl w:val="0"/>
+          <w:numId w:val="1"/>
+        </w:numPr>
+        <w:rPr>
+          <w:rFonts w:ascii="Times New Roman" w:hAnsi="Times New Roman" w:cs="Times New Roman"/>
+          <w:sz w:val="40"/>
+          <w:szCs w:val="40"/>
+        </w:rPr>
+      </w:pPr>
+      <w:r>
+        <w:rPr>
+          <w:rFonts w:ascii="Times New Roman" w:hAnsi="Times New Roman" w:cs="Times New Roman"/>
+          <w:sz w:val="40"/>
+          <w:szCs w:val="40"/>
+        </w:rPr>
+        <w:t>12V</w:t>
+      </w:r>
+    </w:p>
+    <w:p>
+      <w:pPr>
+        <w:pStyle w:val="ListParagraph"/>
+        <w:numPr>
+          <w:ilvl w:val="0"/>
+          <w:numId w:val="1"/>
+        </w:numPr>
+        <w:rPr>
+          <w:rFonts w:ascii="Times New Roman" w:hAnsi="Times New Roman" w:cs="Times New Roman"/>
+          <w:sz w:val="40"/>
+          <w:szCs w:val="40"/>
+        </w:rPr>
+      </w:pPr>
+      <w:r>
+        <w:rPr>
+          <w:rFonts w:ascii="Times New Roman" w:hAnsi="Times New Roman" w:cs="Times New Roman"/>
+          <w:sz w:val="40"/>
+          <w:szCs w:val="40"/>
+        </w:rPr>
+        <w:t xml:space="preserve"> 3.3V</w:t>
+      </w:r>
+    </w:p>
+    <w:p>
+      <w:pPr>
+        <w:pStyle w:val="ListParagraph"/>
+        <w:numPr>
+          <w:ilvl w:val="0"/>
+          <w:numId w:val="1"/>
+        </w:numPr>
+        <w:rPr>
+          <w:rFonts w:ascii="Times New Roman" w:hAnsi="Times New Roman" w:cs="Times New Roman"/>
+          <w:sz w:val="40"/>
+          <w:szCs w:val="40"/>
+        </w:rPr>
+      </w:pPr>
+      <w:r>
+        <w:rPr>
+          <w:rFonts w:ascii="Times New Roman" w:hAnsi="Times New Roman" w:cs="Times New Roman"/>
+          <w:sz w:val="40"/>
+          <w:szCs w:val="40"/>
+        </w:rPr>
+        <w:t>BEMF</w:t>
+      </w:r>
+    </w:p>
+    <w:p>
+      <w:pPr>
+        <w:pStyle w:val="ListParagraph"/>
+        <w:numPr>
+          <w:ilvl w:val="0"/>
+          <w:numId w:val="1"/>
+        </w:numPr>
+        <w:rPr>
+          <w:rFonts w:ascii="Times New Roman" w:hAnsi="Times New Roman" w:cs="Times New Roman"/>
+          <w:sz w:val="40"/>
+          <w:szCs w:val="40"/>
+        </w:rPr>
+      </w:pPr>
+      <w:r>
+        <w:rPr>
+          <w:rFonts w:ascii="Times New Roman" w:hAnsi="Times New Roman" w:cs="Times New Roman"/>
+          <w:sz w:val="40"/>
+          <w:szCs w:val="40"/>
+        </w:rPr>
+        <w:t>Pins</w:t>
+      </w:r>
     </w:p>
     <w:sectPr>
       <w:pgSz w:w="11906" w:h="16838"/>
@@ -465,6 +795,273 @@
     </w:lvl>
   </w:abstractNum>
   <w:abstractNum w:abstractNumId="1" w15:restartNumberingAfterBreak="0">
+    <w:nsid w:val="52683225"/>
+    <w:multiLevelType w:val="hybridMultilevel"/>
+    <w:tmpl w:val="DC703FBA"/>
+    <w:lvl w:ilvl="0" w:tplc="F1FA9844">
+      <w:start w:val="1"/>
+      <w:numFmt w:val="lowerLetter"/>
+      <w:lvlText w:val="%1)"/>
+      <w:lvlJc w:val="left"/>
+      <w:pPr>
+        <w:ind w:left="1800" w:hanging="360"/>
+      </w:pPr>
+      <w:rPr>
+        <w:rFonts w:hint="default"/>
+      </w:rPr>
+    </w:lvl>
+    <w:lvl w:ilvl="1" w:tplc="08090019" w:tentative="1">
+      <w:start w:val="1"/>
+      <w:numFmt w:val="lowerLetter"/>
+      <w:lvlText w:val="%2."/>
+      <w:lvlJc w:val="left"/>
+      <w:pPr>
+        <w:ind w:left="2520" w:hanging="360"/>
+      </w:pPr>
+    </w:lvl>
+    <w:lvl w:ilvl="2" w:tplc="0809001B" w:tentative="1">
+      <w:start w:val="1"/>
+      <w:numFmt w:val="lowerRoman"/>
+      <w:lvlText w:val="%3."/>
+      <w:lvlJc w:val="right"/>
+      <w:pPr>
+        <w:ind w:left="3240" w:hanging="180"/>
+      </w:pPr>
+    </w:lvl>
+    <w:lvl w:ilvl="3" w:tplc="0809000F" w:tentative="1">
+      <w:start w:val="1"/>
+      <w:numFmt w:val="decimal"/>
+      <w:lvlText w:val="%4."/>
+      <w:lvlJc w:val="left"/>
+      <w:pPr>
+        <w:ind w:left="3960" w:hanging="360"/>
+      </w:pPr>
+    </w:lvl>
+    <w:lvl w:ilvl="4" w:tplc="08090019" w:tentative="1">
+      <w:start w:val="1"/>
+      <w:numFmt w:val="lowerLetter"/>
+      <w:lvlText w:val="%5."/>
+      <w:lvlJc w:val="left"/>
+      <w:pPr>
+        <w:ind w:left="4680" w:hanging="360"/>
+      </w:pPr>
+    </w:lvl>
+    <w:lvl w:ilvl="5" w:tplc="0809001B" w:tentative="1">
+      <w:start w:val="1"/>
+      <w:numFmt w:val="lowerRoman"/>
+      <w:lvlText w:val="%6."/>
+      <w:lvlJc w:val="right"/>
+      <w:pPr>
+        <w:ind w:left="5400" w:hanging="180"/>
+      </w:pPr>
+    </w:lvl>
+    <w:lvl w:ilvl="6" w:tplc="0809000F" w:tentative="1">
+      <w:start w:val="1"/>
+      <w:numFmt w:val="decimal"/>
+      <w:lvlText w:val="%7."/>
+      <w:lvlJc w:val="left"/>
+      <w:pPr>
+        <w:ind w:left="6120" w:hanging="360"/>
+      </w:pPr>
+    </w:lvl>
+    <w:lvl w:ilvl="7" w:tplc="08090019" w:tentative="1">
+      <w:start w:val="1"/>
+      <w:numFmt w:val="lowerLetter"/>
+      <w:lvlText w:val="%8."/>
+      <w:lvlJc w:val="left"/>
+      <w:pPr>
+        <w:ind w:left="6840" w:hanging="360"/>
+      </w:pPr>
+    </w:lvl>
+    <w:lvl w:ilvl="8" w:tplc="0809001B" w:tentative="1">
+      <w:start w:val="1"/>
+      <w:numFmt w:val="lowerRoman"/>
+      <w:lvlText w:val="%9."/>
+      <w:lvlJc w:val="right"/>
+      <w:pPr>
+        <w:ind w:left="7560" w:hanging="180"/>
+      </w:pPr>
+    </w:lvl>
+  </w:abstractNum>
+  <w:abstractNum w:abstractNumId="2" w15:restartNumberingAfterBreak="0">
+    <w:nsid w:val="557A69EA"/>
+    <w:multiLevelType w:val="hybridMultilevel"/>
+    <w:tmpl w:val="C2BC1D20"/>
+    <w:lvl w:ilvl="0" w:tplc="42C299B8">
+      <w:start w:val="1"/>
+      <w:numFmt w:val="lowerLetter"/>
+      <w:lvlText w:val="%1)"/>
+      <w:lvlJc w:val="left"/>
+      <w:pPr>
+        <w:ind w:left="1800" w:hanging="360"/>
+      </w:pPr>
+      <w:rPr>
+        <w:rFonts w:hint="default"/>
+      </w:rPr>
+    </w:lvl>
+    <w:lvl w:ilvl="1" w:tplc="08090019" w:tentative="1">
+      <w:start w:val="1"/>
+      <w:numFmt w:val="lowerLetter"/>
+      <w:lvlText w:val="%2."/>
+      <w:lvlJc w:val="left"/>
+      <w:pPr>
+        <w:ind w:left="2520" w:hanging="360"/>
+      </w:pPr>
+    </w:lvl>
+    <w:lvl w:ilvl="2" w:tplc="0809001B" w:tentative="1">
+      <w:start w:val="1"/>
+      <w:numFmt w:val="lowerRoman"/>
+      <w:lvlText w:val="%3."/>
+      <w:lvlJc w:val="right"/>
+      <w:pPr>
+        <w:ind w:left="3240" w:hanging="180"/>
+      </w:pPr>
+    </w:lvl>
+    <w:lvl w:ilvl="3" w:tplc="0809000F" w:tentative="1">
+      <w:start w:val="1"/>
+      <w:numFmt w:val="decimal"/>
+      <w:lvlText w:val="%4."/>
+      <w:lvlJc w:val="left"/>
+      <w:pPr>
+        <w:ind w:left="3960" w:hanging="360"/>
+      </w:pPr>
+    </w:lvl>
+    <w:lvl w:ilvl="4" w:tplc="08090019" w:tentative="1">
+      <w:start w:val="1"/>
+      <w:numFmt w:val="lowerLetter"/>
+      <w:lvlText w:val="%5."/>
+      <w:lvlJc w:val="left"/>
+      <w:pPr>
+        <w:ind w:left="4680" w:hanging="360"/>
+      </w:pPr>
+    </w:lvl>
+    <w:lvl w:ilvl="5" w:tplc="0809001B" w:tentative="1">
+      <w:start w:val="1"/>
+      <w:numFmt w:val="lowerRoman"/>
+      <w:lvlText w:val="%6."/>
+      <w:lvlJc w:val="right"/>
+      <w:pPr>
+        <w:ind w:left="5400" w:hanging="180"/>
+      </w:pPr>
+    </w:lvl>
+    <w:lvl w:ilvl="6" w:tplc="0809000F" w:tentative="1">
+      <w:start w:val="1"/>
+      <w:numFmt w:val="decimal"/>
+      <w:lvlText w:val="%7."/>
+      <w:lvlJc w:val="left"/>
+      <w:pPr>
+        <w:ind w:left="6120" w:hanging="360"/>
+      </w:pPr>
+    </w:lvl>
+    <w:lvl w:ilvl="7" w:tplc="08090019" w:tentative="1">
+      <w:start w:val="1"/>
+      <w:numFmt w:val="lowerLetter"/>
+      <w:lvlText w:val="%8."/>
+      <w:lvlJc w:val="left"/>
+      <w:pPr>
+        <w:ind w:left="6840" w:hanging="360"/>
+      </w:pPr>
+    </w:lvl>
+    <w:lvl w:ilvl="8" w:tplc="0809001B" w:tentative="1">
+      <w:start w:val="1"/>
+      <w:numFmt w:val="lowerRoman"/>
+      <w:lvlText w:val="%9."/>
+      <w:lvlJc w:val="right"/>
+      <w:pPr>
+        <w:ind w:left="7560" w:hanging="180"/>
+      </w:pPr>
+    </w:lvl>
+  </w:abstractNum>
+  <w:abstractNum w:abstractNumId="3" w15:restartNumberingAfterBreak="0">
+    <w:nsid w:val="62FC3096"/>
+    <w:multiLevelType w:val="hybridMultilevel"/>
+    <w:tmpl w:val="762C0586"/>
+    <w:lvl w:ilvl="0" w:tplc="B4FA7C78">
+      <w:start w:val="1"/>
+      <w:numFmt w:val="lowerLetter"/>
+      <w:lvlText w:val="%1)"/>
+      <w:lvlJc w:val="left"/>
+      <w:pPr>
+        <w:ind w:left="1800" w:hanging="360"/>
+      </w:pPr>
+      <w:rPr>
+        <w:rFonts w:hint="default"/>
+      </w:rPr>
+    </w:lvl>
+    <w:lvl w:ilvl="1" w:tplc="08090019" w:tentative="1">
+      <w:start w:val="1"/>
+      <w:numFmt w:val="lowerLetter"/>
+      <w:lvlText w:val="%2."/>
+      <w:lvlJc w:val="left"/>
+      <w:pPr>
+        <w:ind w:left="2520" w:hanging="360"/>
+      </w:pPr>
+    </w:lvl>
+    <w:lvl w:ilvl="2" w:tplc="0809001B" w:tentative="1">
+      <w:start w:val="1"/>
+      <w:numFmt w:val="lowerRoman"/>
+      <w:lvlText w:val="%3."/>
+      <w:lvlJc w:val="right"/>
+      <w:pPr>
+        <w:ind w:left="3240" w:hanging="180"/>
+      </w:pPr>
+    </w:lvl>
+    <w:lvl w:ilvl="3" w:tplc="0809000F" w:tentative="1">
+      <w:start w:val="1"/>
+      <w:numFmt w:val="decimal"/>
+      <w:lvlText w:val="%4."/>
+      <w:lvlJc w:val="left"/>
+      <w:pPr>
+        <w:ind w:left="3960" w:hanging="360"/>
+      </w:pPr>
+    </w:lvl>
+    <w:lvl w:ilvl="4" w:tplc="08090019" w:tentative="1">
+      <w:start w:val="1"/>
+      <w:numFmt w:val="lowerLetter"/>
+      <w:lvlText w:val="%5."/>
+      <w:lvlJc w:val="left"/>
+      <w:pPr>
+        <w:ind w:left="4680" w:hanging="360"/>
+      </w:pPr>
+    </w:lvl>
+    <w:lvl w:ilvl="5" w:tplc="0809001B" w:tentative="1">
+      <w:start w:val="1"/>
+      <w:numFmt w:val="lowerRoman"/>
+      <w:lvlText w:val="%6."/>
+      <w:lvlJc w:val="right"/>
+      <w:pPr>
+        <w:ind w:left="5400" w:hanging="180"/>
+      </w:pPr>
+    </w:lvl>
+    <w:lvl w:ilvl="6" w:tplc="0809000F" w:tentative="1">
+      <w:start w:val="1"/>
+      <w:numFmt w:val="decimal"/>
+      <w:lvlText w:val="%7."/>
+      <w:lvlJc w:val="left"/>
+      <w:pPr>
+        <w:ind w:left="6120" w:hanging="360"/>
+      </w:pPr>
+    </w:lvl>
+    <w:lvl w:ilvl="7" w:tplc="08090019" w:tentative="1">
+      <w:start w:val="1"/>
+      <w:numFmt w:val="lowerLetter"/>
+      <w:lvlText w:val="%8."/>
+      <w:lvlJc w:val="left"/>
+      <w:pPr>
+        <w:ind w:left="6840" w:hanging="360"/>
+      </w:pPr>
+    </w:lvl>
+    <w:lvl w:ilvl="8" w:tplc="0809001B" w:tentative="1">
+      <w:start w:val="1"/>
+      <w:numFmt w:val="lowerRoman"/>
+      <w:lvlText w:val="%9."/>
+      <w:lvlJc w:val="right"/>
+      <w:pPr>
+        <w:ind w:left="7560" w:hanging="180"/>
+      </w:pPr>
+    </w:lvl>
+  </w:abstractNum>
+  <w:abstractNum w:abstractNumId="4" w15:restartNumberingAfterBreak="0">
     <w:nsid w:val="63B3242F"/>
     <w:multiLevelType w:val="hybridMultilevel"/>
     <w:tmpl w:val="151055DA"/>
@@ -554,10 +1151,19 @@
     </w:lvl>
   </w:abstractNum>
   <w:num w:numId="1" w16cid:durableId="345181995">
-    <w:abstractNumId w:val="1"/>
+    <w:abstractNumId w:val="4"/>
   </w:num>
   <w:num w:numId="2" w16cid:durableId="627709868">
     <w:abstractNumId w:val="0"/>
+  </w:num>
+  <w:num w:numId="3" w16cid:durableId="467013523">
+    <w:abstractNumId w:val="2"/>
+  </w:num>
+  <w:num w:numId="4" w16cid:durableId="904992127">
+    <w:abstractNumId w:val="3"/>
+  </w:num>
+  <w:num w:numId="5" w16cid:durableId="1817406220">
+    <w:abstractNumId w:val="1"/>
   </w:num>
 </w:numbering>
 </file>

</xml_diff>

<commit_message>
added initiall 3 phase documentation
</commit_message>
<xml_diff>
--- a/Documentation.docx
+++ b/Documentation.docx
@@ -58,27 +58,7 @@
           <w:bCs/>
           <w:lang w:val="en-GB"/>
         </w:rPr>
-        <w:t xml:space="preserve">INA180A1IDBVR TEXAS INSTRUMENTS – Measure </w:t>
-      </w:r>
-      <w:proofErr w:type="spellStart"/>
-      <w:r>
-        <w:rPr>
-          <w:rFonts w:ascii="Times New Roman" w:hAnsi="Times New Roman" w:cs="Times New Roman"/>
-          <w:b/>
-          <w:bCs/>
-          <w:lang w:val="en-GB"/>
-        </w:rPr>
-        <w:t>opamp</w:t>
-      </w:r>
-      <w:proofErr w:type="spellEnd"/>
-      <w:r>
-        <w:rPr>
-          <w:rFonts w:ascii="Times New Roman" w:hAnsi="Times New Roman" w:cs="Times New Roman"/>
-          <w:b/>
-          <w:bCs/>
-          <w:lang w:val="en-GB"/>
-        </w:rPr>
-        <w:t xml:space="preserve"> </w:t>
+        <w:t xml:space="preserve">INA180A1IDBVR TEXAS INSTRUMENTS – Measure opamp </w:t>
       </w:r>
       <w:r>
         <w:rPr>
@@ -139,23 +119,7 @@
           <w:rFonts w:ascii="Times New Roman" w:hAnsi="Times New Roman" w:cs="Times New Roman"/>
           <w:lang w:val="en-GB"/>
         </w:rPr>
-        <w:t xml:space="preserve">Used </w:t>
-      </w:r>
-      <w:proofErr w:type="spellStart"/>
-      <w:r>
-        <w:rPr>
-          <w:rFonts w:ascii="Times New Roman" w:hAnsi="Times New Roman" w:cs="Times New Roman"/>
-          <w:lang w:val="en-GB"/>
-        </w:rPr>
-        <w:t>opamp</w:t>
-      </w:r>
-      <w:proofErr w:type="spellEnd"/>
-      <w:r>
-        <w:rPr>
-          <w:rFonts w:ascii="Times New Roman" w:hAnsi="Times New Roman" w:cs="Times New Roman"/>
-          <w:lang w:val="en-GB"/>
-        </w:rPr>
-        <w:t xml:space="preserve"> data sheet typical application:</w:t>
+        <w:t>Used opamp data sheet typical application:</w:t>
       </w:r>
     </w:p>
     <w:p>
@@ -207,59 +171,34 @@
           <w:lang w:val="en-GB"/>
         </w:rPr>
       </w:pPr>
-      <w:proofErr w:type="spellStart"/>
       <w:r>
         <w:rPr>
           <w:rFonts w:ascii="Times New Roman" w:hAnsi="Times New Roman" w:cs="Times New Roman"/>
           <w:lang w:val="en-GB"/>
         </w:rPr>
-        <w:t>Cbypass</w:t>
-      </w:r>
-      <w:proofErr w:type="spellEnd"/>
+        <w:t>Cbypass – 0.1uF</w:t>
+      </w:r>
       <w:r>
         <w:rPr>
           <w:rFonts w:ascii="Times New Roman" w:hAnsi="Times New Roman" w:cs="Times New Roman"/>
           <w:lang w:val="en-GB"/>
         </w:rPr>
-        <w:t xml:space="preserve"> – 0.1uF</w:t>
-      </w:r>
-      <w:r>
+        <w:t xml:space="preserve"> 0805</w:t>
+      </w:r>
+    </w:p>
+    <w:p>
+      <w:pPr>
         <w:rPr>
           <w:rFonts w:ascii="Times New Roman" w:hAnsi="Times New Roman" w:cs="Times New Roman"/>
           <w:lang w:val="en-GB"/>
         </w:rPr>
-        <w:t xml:space="preserve"> 0805</w:t>
-      </w:r>
-    </w:p>
-    <w:p>
-      <w:pPr>
+      </w:pPr>
+      <w:r>
         <w:rPr>
           <w:rFonts w:ascii="Times New Roman" w:hAnsi="Times New Roman" w:cs="Times New Roman"/>
           <w:lang w:val="en-GB"/>
         </w:rPr>
-      </w:pPr>
-      <w:r>
-        <w:rPr>
-          <w:rFonts w:ascii="Times New Roman" w:hAnsi="Times New Roman" w:cs="Times New Roman"/>
-          <w:lang w:val="en-GB"/>
-        </w:rPr>
-        <w:t xml:space="preserve">Added RC filter with fc = 1.6kHz to cutoff </w:t>
-      </w:r>
-      <w:proofErr w:type="spellStart"/>
-      <w:r>
-        <w:rPr>
-          <w:rFonts w:ascii="Times New Roman" w:hAnsi="Times New Roman" w:cs="Times New Roman"/>
-          <w:lang w:val="en-GB"/>
-        </w:rPr>
-        <w:t>pwm</w:t>
-      </w:r>
-      <w:proofErr w:type="spellEnd"/>
-      <w:r>
-        <w:rPr>
-          <w:rFonts w:ascii="Times New Roman" w:hAnsi="Times New Roman" w:cs="Times New Roman"/>
-          <w:lang w:val="en-GB"/>
-        </w:rPr>
-        <w:t xml:space="preserve"> noise.</w:t>
+        <w:t>Added RC filter with fc = 1.6kHz to cutoff pwm noise.</w:t>
       </w:r>
     </w:p>
     <w:p>
@@ -393,6 +332,7 @@
       <w:r>
         <w:rPr>
           <w:rFonts w:ascii="Times New Roman" w:hAnsi="Times New Roman" w:cs="Times New Roman"/>
+          <w:noProof/>
           <w:lang w:val="en-GB"/>
         </w:rPr>
         <w:drawing>
@@ -520,6 +460,7 @@
       <w:r>
         <w:rPr>
           <w:rFonts w:ascii="Times New Roman" w:hAnsi="Times New Roman" w:cs="Times New Roman"/>
+          <w:noProof/>
         </w:rPr>
         <w:drawing>
           <wp:inline distT="0" distB="0" distL="0" distR="0" wp14:anchorId="0140A4C9" wp14:editId="3CCDF26B">
@@ -578,6 +519,195 @@
           <w:szCs w:val="40"/>
         </w:rPr>
         <w:lastRenderedPageBreak/>
+        <w:t>3 Phase</w:t>
+      </w:r>
+    </w:p>
+    <w:p>
+      <w:pPr>
+        <w:pStyle w:val="ListParagraph"/>
+        <w:rPr>
+          <w:rFonts w:ascii="Times New Roman" w:hAnsi="Times New Roman" w:cs="Times New Roman"/>
+        </w:rPr>
+      </w:pPr>
+      <w:r>
+        <w:rPr>
+          <w:rFonts w:ascii="Times New Roman" w:hAnsi="Times New Roman" w:cs="Times New Roman"/>
+        </w:rPr>
+        <w:t>Components used:</w:t>
+      </w:r>
+    </w:p>
+    <w:p>
+      <w:pPr>
+        <w:pStyle w:val="ListParagraph"/>
+        <w:numPr>
+          <w:ilvl w:val="0"/>
+          <w:numId w:val="6"/>
+        </w:numPr>
+        <w:rPr>
+          <w:rFonts w:ascii="Times New Roman" w:hAnsi="Times New Roman" w:cs="Times New Roman"/>
+        </w:rPr>
+      </w:pPr>
+      <w:r>
+        <w:rPr>
+          <w:rFonts w:ascii="Times New Roman" w:hAnsi="Times New Roman" w:cs="Times New Roman"/>
+        </w:rPr>
+        <w:t>WMB010N04LG4</w:t>
+      </w:r>
+      <w:r>
+        <w:rPr>
+          <w:rFonts w:ascii="Times New Roman" w:hAnsi="Times New Roman" w:cs="Times New Roman"/>
+        </w:rPr>
+        <w:t xml:space="preserve"> – N-Mosfet</w:t>
+      </w:r>
+    </w:p>
+    <w:p>
+      <w:pPr>
+        <w:pStyle w:val="ListParagraph"/>
+        <w:numPr>
+          <w:ilvl w:val="0"/>
+          <w:numId w:val="6"/>
+        </w:numPr>
+        <w:rPr>
+          <w:rFonts w:ascii="Times New Roman" w:hAnsi="Times New Roman" w:cs="Times New Roman"/>
+        </w:rPr>
+      </w:pPr>
+      <w:r>
+        <w:rPr>
+          <w:rFonts w:ascii="Times New Roman" w:hAnsi="Times New Roman" w:cs="Times New Roman"/>
+        </w:rPr>
+        <w:t>22R and 10k resistors 0805</w:t>
+      </w:r>
+    </w:p>
+    <w:p>
+      <w:pPr>
+        <w:pStyle w:val="ListParagraph"/>
+        <w:numPr>
+          <w:ilvl w:val="0"/>
+          <w:numId w:val="6"/>
+        </w:numPr>
+        <w:rPr>
+          <w:rFonts w:ascii="Times New Roman" w:hAnsi="Times New Roman" w:cs="Times New Roman"/>
+          <w:lang w:val="en-GB"/>
+        </w:rPr>
+      </w:pPr>
+      <w:r>
+        <w:rPr>
+          <w:rFonts w:ascii="Times New Roman" w:hAnsi="Times New Roman" w:cs="Times New Roman"/>
+          <w:lang w:val="en-GB"/>
+        </w:rPr>
+        <w:t>100n and 1u ceramic c</w:t>
+      </w:r>
+      <w:r>
+        <w:rPr>
+          <w:rFonts w:ascii="Times New Roman" w:hAnsi="Times New Roman" w:cs="Times New Roman"/>
+          <w:lang w:val="en-GB"/>
+        </w:rPr>
+        <w:t>apacitors 0805</w:t>
+      </w:r>
+    </w:p>
+    <w:p>
+      <w:pPr>
+        <w:ind w:left="1440"/>
+        <w:rPr>
+          <w:rFonts w:ascii="Times New Roman" w:hAnsi="Times New Roman" w:cs="Times New Roman"/>
+          <w:lang w:val="en-GB"/>
+        </w:rPr>
+      </w:pPr>
+    </w:p>
+    <w:p>
+      <w:pPr>
+        <w:pStyle w:val="ListParagraph"/>
+        <w:rPr>
+          <w:rFonts w:ascii="Times New Roman" w:hAnsi="Times New Roman" w:cs="Times New Roman"/>
+          <w:sz w:val="40"/>
+          <w:szCs w:val="40"/>
+        </w:rPr>
+      </w:pPr>
+      <w:r>
+        <w:rPr>
+          <w:rFonts w:ascii="Times New Roman" w:hAnsi="Times New Roman" w:cs="Times New Roman"/>
+          <w:sz w:val="40"/>
+          <w:szCs w:val="40"/>
+        </w:rPr>
+        <w:drawing>
+          <wp:inline distT="0" distB="0" distL="0" distR="0" wp14:anchorId="1B7B924E" wp14:editId="39BAEB80">
+            <wp:extent cx="5731510" cy="2924175"/>
+            <wp:effectExtent l="0" t="0" r="2540" b="9525"/>
+            <wp:docPr id="1512212647" name="Picture 1"/>
+            <wp:cNvGraphicFramePr>
+              <a:graphicFrameLocks xmlns:a="http://schemas.openxmlformats.org/drawingml/2006/main" noChangeAspect="1"/>
+            </wp:cNvGraphicFramePr>
+            <a:graphic xmlns:a="http://schemas.openxmlformats.org/drawingml/2006/main">
+              <a:graphicData uri="http://schemas.openxmlformats.org/drawingml/2006/picture">
+                <pic:pic xmlns:pic="http://schemas.openxmlformats.org/drawingml/2006/picture">
+                  <pic:nvPicPr>
+                    <pic:cNvPr id="1512212647" name=""/>
+                    <pic:cNvPicPr/>
+                  </pic:nvPicPr>
+                  <pic:blipFill>
+                    <a:blip r:embed="rId11"/>
+                    <a:stretch>
+                      <a:fillRect/>
+                    </a:stretch>
+                  </pic:blipFill>
+                  <pic:spPr>
+                    <a:xfrm>
+                      <a:off x="0" y="0"/>
+                      <a:ext cx="5731510" cy="2924175"/>
+                    </a:xfrm>
+                    <a:prstGeom prst="rect">
+                      <a:avLst/>
+                    </a:prstGeom>
+                  </pic:spPr>
+                </pic:pic>
+              </a:graphicData>
+            </a:graphic>
+          </wp:inline>
+        </w:drawing>
+      </w:r>
+    </w:p>
+    <w:p>
+      <w:pPr>
+        <w:pStyle w:val="ListParagraph"/>
+        <w:rPr>
+          <w:rFonts w:ascii="Times New Roman" w:hAnsi="Times New Roman" w:cs="Times New Roman"/>
+          <w:lang w:val="en-GB"/>
+        </w:rPr>
+      </w:pPr>
+      <w:r>
+        <w:rPr>
+          <w:rFonts w:ascii="Times New Roman" w:hAnsi="Times New Roman" w:cs="Times New Roman"/>
+          <w:lang w:val="en-GB"/>
+        </w:rPr>
+        <w:t>Rgate and Cbypass will be determi</w:t>
+      </w:r>
+      <w:r>
+        <w:rPr>
+          <w:rFonts w:ascii="Times New Roman" w:hAnsi="Times New Roman" w:cs="Times New Roman"/>
+          <w:lang w:val="en-GB"/>
+        </w:rPr>
+        <w:t>ned in testing process</w:t>
+      </w:r>
+    </w:p>
+    <w:p>
+      <w:pPr>
+        <w:pStyle w:val="ListParagraph"/>
+        <w:numPr>
+          <w:ilvl w:val="0"/>
+          <w:numId w:val="1"/>
+        </w:numPr>
+        <w:rPr>
+          <w:rFonts w:ascii="Times New Roman" w:hAnsi="Times New Roman" w:cs="Times New Roman"/>
+          <w:sz w:val="40"/>
+          <w:szCs w:val="40"/>
+        </w:rPr>
+      </w:pPr>
+      <w:r>
+        <w:rPr>
+          <w:rFonts w:ascii="Times New Roman" w:hAnsi="Times New Roman" w:cs="Times New Roman"/>
+          <w:sz w:val="40"/>
+          <w:szCs w:val="40"/>
+        </w:rPr>
         <w:t>MOSFET Driver</w:t>
       </w:r>
     </w:p>
@@ -1150,6 +1280,95 @@
       </w:pPr>
     </w:lvl>
   </w:abstractNum>
+  <w:abstractNum w:abstractNumId="5" w15:restartNumberingAfterBreak="0">
+    <w:nsid w:val="666923CB"/>
+    <w:multiLevelType w:val="hybridMultilevel"/>
+    <w:tmpl w:val="6CEC2918"/>
+    <w:lvl w:ilvl="0" w:tplc="2DD6E1FE">
+      <w:start w:val="1"/>
+      <w:numFmt w:val="lowerLetter"/>
+      <w:lvlText w:val="%1)"/>
+      <w:lvlJc w:val="left"/>
+      <w:pPr>
+        <w:ind w:left="1800" w:hanging="360"/>
+      </w:pPr>
+      <w:rPr>
+        <w:rFonts w:hint="default"/>
+      </w:rPr>
+    </w:lvl>
+    <w:lvl w:ilvl="1" w:tplc="08090019" w:tentative="1">
+      <w:start w:val="1"/>
+      <w:numFmt w:val="lowerLetter"/>
+      <w:lvlText w:val="%2."/>
+      <w:lvlJc w:val="left"/>
+      <w:pPr>
+        <w:ind w:left="2520" w:hanging="360"/>
+      </w:pPr>
+    </w:lvl>
+    <w:lvl w:ilvl="2" w:tplc="0809001B" w:tentative="1">
+      <w:start w:val="1"/>
+      <w:numFmt w:val="lowerRoman"/>
+      <w:lvlText w:val="%3."/>
+      <w:lvlJc w:val="right"/>
+      <w:pPr>
+        <w:ind w:left="3240" w:hanging="180"/>
+      </w:pPr>
+    </w:lvl>
+    <w:lvl w:ilvl="3" w:tplc="0809000F" w:tentative="1">
+      <w:start w:val="1"/>
+      <w:numFmt w:val="decimal"/>
+      <w:lvlText w:val="%4."/>
+      <w:lvlJc w:val="left"/>
+      <w:pPr>
+        <w:ind w:left="3960" w:hanging="360"/>
+      </w:pPr>
+    </w:lvl>
+    <w:lvl w:ilvl="4" w:tplc="08090019" w:tentative="1">
+      <w:start w:val="1"/>
+      <w:numFmt w:val="lowerLetter"/>
+      <w:lvlText w:val="%5."/>
+      <w:lvlJc w:val="left"/>
+      <w:pPr>
+        <w:ind w:left="4680" w:hanging="360"/>
+      </w:pPr>
+    </w:lvl>
+    <w:lvl w:ilvl="5" w:tplc="0809001B" w:tentative="1">
+      <w:start w:val="1"/>
+      <w:numFmt w:val="lowerRoman"/>
+      <w:lvlText w:val="%6."/>
+      <w:lvlJc w:val="right"/>
+      <w:pPr>
+        <w:ind w:left="5400" w:hanging="180"/>
+      </w:pPr>
+    </w:lvl>
+    <w:lvl w:ilvl="6" w:tplc="0809000F" w:tentative="1">
+      <w:start w:val="1"/>
+      <w:numFmt w:val="decimal"/>
+      <w:lvlText w:val="%7."/>
+      <w:lvlJc w:val="left"/>
+      <w:pPr>
+        <w:ind w:left="6120" w:hanging="360"/>
+      </w:pPr>
+    </w:lvl>
+    <w:lvl w:ilvl="7" w:tplc="08090019" w:tentative="1">
+      <w:start w:val="1"/>
+      <w:numFmt w:val="lowerLetter"/>
+      <w:lvlText w:val="%8."/>
+      <w:lvlJc w:val="left"/>
+      <w:pPr>
+        <w:ind w:left="6840" w:hanging="360"/>
+      </w:pPr>
+    </w:lvl>
+    <w:lvl w:ilvl="8" w:tplc="0809001B" w:tentative="1">
+      <w:start w:val="1"/>
+      <w:numFmt w:val="lowerRoman"/>
+      <w:lvlText w:val="%9."/>
+      <w:lvlJc w:val="right"/>
+      <w:pPr>
+        <w:ind w:left="7560" w:hanging="180"/>
+      </w:pPr>
+    </w:lvl>
+  </w:abstractNum>
   <w:num w:numId="1" w16cid:durableId="345181995">
     <w:abstractNumId w:val="4"/>
   </w:num>
@@ -1164,6 +1383,9 @@
   </w:num>
   <w:num w:numId="5" w16cid:durableId="1817406220">
     <w:abstractNumId w:val="1"/>
+  </w:num>
+  <w:num w:numId="6" w16cid:durableId="264385953">
+    <w:abstractNumId w:val="5"/>
   </w:num>
 </w:numbering>
 </file>
@@ -1774,6 +1996,7 @@
   <w:style w:type="character" w:default="1" w:styleId="DefaultParagraphFont">
     <w:name w:val="Default Paragraph Font"/>
     <w:uiPriority w:val="1"/>
+    <w:semiHidden/>
     <w:unhideWhenUsed/>
   </w:style>
   <w:style w:type="table" w:default="1" w:styleId="TableNormal">

</xml_diff>